<commit_message>
Split BLUEPRINT into parts, rebuild style guide
</commit_message>
<xml_diff>
--- a/Blueprint/BLUEPRINT.docx
+++ b/Blueprint/BLUEPRINT.docx
@@ -42876,6 +42876,26 @@
       </w:r>
     </w:p>
     <w:p>
+      <w:pPr/>
+      <w:r>
+        <w:rPr>
+          <w:b w:val="0"/>
+          <w:i w:val="0"/>
+        </w:rPr>
+        <w:t>the</w:t>
+      </w:r>
+      <w:r>
+        <w:t xml:space="preserve"> </w:t>
+      </w:r>
+      <w:r>
+        <w:rPr>
+          <w:b w:val="0"/>
+          <w:i w:val="0"/>
+        </w:rPr>
+        <w:t>lookups</w:t>
+      </w:r>
+    </w:p>
+    <w:p>
       <w:pPr>
         <w:pStyle w:val="BKPCode"/>
         <w:keepLines/>
@@ -46442,6 +46462,7 @@
       <w:headerReference w:type="even" r:id="rId16"/>
       <w:footerReference w:type="default" r:id="rId17"/>
       <w:footerReference w:type="even" r:id="rId18"/>
+      <w:headerReference w:type="first" r:id="rId19"/>
       <w:pgSz w:h="15840" w:w="12240" w:orient="portrait"/>
       <w:pgMar w:bottom="1037" w:top="1080" w:left="1181" w:right="1181" w:header="432" w:footer="490"/>
       <w:titlePg/>
@@ -46658,7 +46679,7 @@
         <w:color w:val="A8A8A8"/>
         <w:sz w:val="20"/>
       </w:rPr>
-      <w:t>070826_all_rebuild | go.fuzzylogic.page/core</w:t>
+      <w:t>090826_reg_part-opening | go.fuzzylogic.page/core</w:t>
     </w:r>
   </w:p>
 </w:hdr>
@@ -46725,6 +46746,27 @@
       <w:fldChar w:fldCharType="separate"/>
       <w:t>1</w:t>
       <w:fldChar w:fldCharType="end"/>
+    </w:r>
+  </w:p>
+</w:hdr>
+</file>
+
+<file path=word/header8.xml><?xml version="1.0" encoding="utf-8"?>
+<w:hdr xmlns:m="http://schemas.openxmlformats.org/officeDocument/2006/math" xmlns:mc="http://schemas.openxmlformats.org/markup-compatibility/2006" xmlns:mo="http://schemas.microsoft.com/office/mac/office/2008/main" xmlns:mv="urn:schemas-microsoft-com:mac:vml" xmlns:o="urn:schemas-microsoft-com:office:office" xmlns:r="http://schemas.openxmlformats.org/officeDocument/2006/relationships" xmlns:v="urn:schemas-microsoft-com:vml" xmlns:w10="urn:schemas-microsoft-com:office:word" xmlns:w14="http://schemas.microsoft.com/office/word/2010/wordml" xmlns:w="http://schemas.openxmlformats.org/wordprocessingml/2006/main" xmlns:wne="http://schemas.microsoft.com/office/word/2006/wordml" xmlns:wp14="http://schemas.microsoft.com/office/word/2010/wordprocessingDrawing" xmlns:wp="http://schemas.openxmlformats.org/drawingml/2006/wordprocessingDrawing" xmlns:wpc="http://schemas.microsoft.com/office/word/2010/wordprocessingCanvas" xmlns:wpg="http://schemas.microsoft.com/office/word/2010/wordprocessingGroup" xmlns:wpi="http://schemas.microsoft.com/office/word/2010/wordprocessingInk" xmlns:wps="http://schemas.microsoft.com/office/word/2010/wordprocessingShape" mc:Ignorable="w14 wp14">
+  <w:p>
+    <w:pPr>
+      <w:pStyle w:val="BKPFooter"/>
+      <w:jc w:val="right"/>
+      <w:pBdr>
+        <w:bottom w:val="single" w:sz="6" w:space="2" w:color="000000"/>
+      </w:pBdr>
+    </w:pPr>
+    <w:r>
+      <w:rPr>
+        <w:color w:val="A8A8A8"/>
+        <w:sz w:val="20"/>
+      </w:rPr>
+      <w:t>090826_reg_part-opening | go.fuzzylogic.page/reg</w:t>
     </w:r>
   </w:p>
 </w:hdr>

</xml_diff>